<commit_message>
download cv button update
</commit_message>
<xml_diff>
--- a/_site/cv.docx
+++ b/_site/cv.docx
@@ -95,6 +95,23 @@
       </w:r>
       <w:r>
         <w:t xml:space="preserve">Web of Science</w:t>
+      </w:r>
+    </w:p>
+    <w:p>
+      <w:pPr>
+        <w:pStyle w:val="BodyText"/>
+      </w:pPr>
+      <w:r>
+        <w:t xml:space="preserve"> </w:t>
+      </w:r>
+      <w:r>
+        <w:t xml:space="preserve"> </w:t>
+      </w:r>
+      <w:r>
+        <w:t xml:space="preserve">Download CV (PDF)</w:t>
+      </w:r>
+      <w:r>
+        <w:t xml:space="preserve"> </w:t>
       </w:r>
     </w:p>
     <w:bookmarkStart w:id="20" w:name="personal-profile"/>

</xml_diff>